<commit_message>
docs(report): update demo port to 8085 to avoid conflicts with docker containers
</commit_message>
<xml_diff>
--- a/BAO_CAO_THUC_NGHIEM_SWS.docx
+++ b/BAO_CAO_THUC_NGHIEM_SWS.docx
@@ -508,7 +508,7 @@
             </w:pPr>
             <w:r>
               <w:rPr/>
-              <w:t>8080</w:t>
+              <w:t>8085</w:t>
             </w:r>
           </w:p>
         </w:tc>
@@ -2381,7 +2381,7 @@
           <w:bdr w:val="single" w:sz="24" w:space="9" w:color="2980B9"/>
           <w:shd w:fill="F4F4F4" w:val="clear"/>
         </w:rPr>
-        <w:t>./sws -d -p 8080 -c test/cgi-bin -l test/access.log test/www</w:t>
+        <w:t>./sws -d -p 8085 -c test/cgi-bin -l test/access.log test/www</w:t>
       </w:r>
     </w:p>
     <w:p>
@@ -2401,7 +2401,7 @@
       </w:r>
       <w:r>
         <w:rPr/>
-        <w:t xml:space="preserve"> Máy chủ chạy trực tiếp trên console (foreground), lắng nghe cổng 8080 và in toàn bộ nhật ký truy cập trực tiếp ra màn hình terminal.</w:t>
+        <w:t xml:space="preserve"> Máy chủ chạy trực tiếp trên console (foreground), lắng nghe cổng 8085 và in toàn bộ nhật ký truy cập trực tiếp ra màn hình terminal.</w:t>
       </w:r>
     </w:p>
     <w:p>
@@ -2449,7 +2449,7 @@
           <w:color w:val="444444"/>
           <w:sz w:val="22"/>
         </w:rPr>
-        <w:t>Hình 3: Máy chủ sws đang chạy ở chế độ Debug trên cổng 8080</w:t>
+        <w:t>Hình 3: Máy chủ sws đang chạy ở chế độ Debug trên cổng 8085</w:t>
       </w:r>
     </w:p>
     <w:p>
@@ -2505,7 +2505,7 @@
           <w:bdr w:val="single" w:sz="24" w:space="9" w:color="2980B9"/>
           <w:shd w:fill="F4F4F4" w:val="clear"/>
         </w:rPr>
-        <w:t>curl -i http://localhost:8080/index.html</w:t>
+        <w:t>curl -i http://localhost:8085/index.html</w:t>
       </w:r>
     </w:p>
     <w:p>
@@ -2527,7 +2527,7 @@
         <w:rPr>
           <w:rStyle w:val="SourceText"/>
         </w:rPr>
-        <w:t>http://localhost:8080</w:t>
+        <w:t>http://localhost:8085</w:t>
       </w:r>
       <w:r>
         <w:rPr>
@@ -2697,7 +2697,7 @@
           <w:bdr w:val="single" w:sz="24" w:space="9" w:color="2980B9"/>
           <w:shd w:fill="F4F4F4" w:val="clear"/>
         </w:rPr>
-        <w:t>curl -i -I http://localhost:8080/index.html</w:t>
+        <w:t>curl -i -I http://localhost:8085/index.html</w:t>
       </w:r>
     </w:p>
     <w:p>
@@ -2831,7 +2831,7 @@
           <w:bdr w:val="single" w:sz="24" w:space="9" w:color="2980B9"/>
           <w:shd w:fill="F4F4F4" w:val="clear"/>
         </w:rPr>
-        <w:t>curl -i http://localhost:8080/docs/</w:t>
+        <w:t>curl -i http://localhost:8085/docs/</w:t>
       </w:r>
     </w:p>
     <w:p>
@@ -2853,7 +2853,7 @@
         <w:rPr>
           <w:rStyle w:val="SourceText"/>
         </w:rPr>
-        <w:t>http://localhost:8080/docs/</w:t>
+        <w:t>http://localhost:8085/docs/</w:t>
       </w:r>
       <w:r>
         <w:rPr>
@@ -3013,7 +3013,7 @@
           <w:bdr w:val="single" w:sz="24" w:space="9" w:color="2980B9"/>
           <w:shd w:fill="F4F4F4" w:val="clear"/>
         </w:rPr>
-        <w:t>curl -i http://localhost:8080/cgi-bin/hello.cgi</w:t>
+        <w:t>curl -i http://localhost:8085/cgi-bin/hello.cgi</w:t>
       </w:r>
     </w:p>
     <w:p>
@@ -3069,7 +3069,7 @@
         <w:rPr>
           <w:rStyle w:val="SourceText"/>
         </w:rPr>
-        <w:t>SERVER_PORT=8080</w:t>
+        <w:t>SERVER_PORT=8085</w:t>
       </w:r>
       <w:r>
         <w:rPr/>
@@ -3177,7 +3177,7 @@
           <w:bdr w:val="single" w:sz="24" w:space="9" w:color="2980B9"/>
           <w:shd w:fill="F4F4F4" w:val="clear"/>
         </w:rPr>
-        <w:t>curl -i http://localhost:8080/../../etc/passwd</w:t>
+        <w:t>curl -i http://localhost:8085/../../etc/passwd</w:t>
       </w:r>
     </w:p>
     <w:p>
@@ -3465,7 +3465,7 @@
           <w:bdr w:val="single" w:sz="24" w:space="9" w:color="2980B9"/>
           <w:shd w:fill="F4F4F4" w:val="clear"/>
         </w:rPr>
-        <w:t>./sws -p 8080 -c test/cgi-bin -l test/access.log test/www</w:t>
+        <w:t>./sws -p 8085 -c test/cgi-bin -l test/access.log test/www</w:t>
         <w:br/>
         <w:t>ps -ef | grep sws</w:t>
       </w:r>

</xml_diff>